<commit_message>
Update RW-TF-FST-02-06(00) Software Design Specifications (SDS).docx
표지 수정
</commit_message>
<xml_diff>
--- a/Document/RV200/RW-TF-FST-02-06(00) Software Design Specifications (SDS).docx
+++ b/Document/RV200/RW-TF-FST-02-06(00) Software Design Specifications (SDS).docx
@@ -32,6 +32,7 @@
             <w:pPr>
               <w:jc w:val="center"/>
               <w:rPr>
+                <w:rFonts w:hint="eastAsia"/>
                 <w:sz w:val="72"/>
                 <w:szCs w:val="72"/>
               </w:rPr>
@@ -39,12 +40,13 @@
             <w:bookmarkStart w:id="0" w:name="_Hlk164273393"/>
             <w:r>
               <w:rPr>
+                <w:rFonts w:hint="eastAsia"/>
                 <w:b/>
                 <w:bCs/>
                 <w:sz w:val="72"/>
                 <w:szCs w:val="72"/>
               </w:rPr>
-              <w:t>Risk Management</w:t>
+              <w:t>Software Design Specification</w:t>
             </w:r>
           </w:p>
         </w:tc>
@@ -2349,7 +2351,6 @@
         <w:tc>
           <w:tcPr>
             <w:tcW w:w="5524" w:type="dxa"/>
-            <w:shd w:val="clear" w:color="auto" w:fill="auto"/>
             <w:vAlign w:val="center"/>
           </w:tcPr>
           <w:p>
@@ -2373,7 +2374,6 @@
         <w:tc>
           <w:tcPr>
             <w:tcW w:w="4115" w:type="dxa"/>
-            <w:shd w:val="clear" w:color="auto" w:fill="auto"/>
             <w:vAlign w:val="center"/>
           </w:tcPr>
           <w:p>
@@ -2403,7 +2403,6 @@
         <w:tc>
           <w:tcPr>
             <w:tcW w:w="5524" w:type="dxa"/>
-            <w:shd w:val="clear" w:color="auto" w:fill="auto"/>
             <w:vAlign w:val="center"/>
           </w:tcPr>
           <w:p>
@@ -2427,7 +2426,6 @@
         <w:tc>
           <w:tcPr>
             <w:tcW w:w="4115" w:type="dxa"/>
-            <w:shd w:val="clear" w:color="auto" w:fill="auto"/>
             <w:vAlign w:val="center"/>
           </w:tcPr>
           <w:p>
@@ -2457,7 +2455,6 @@
         <w:tc>
           <w:tcPr>
             <w:tcW w:w="5524" w:type="dxa"/>
-            <w:shd w:val="clear" w:color="auto" w:fill="auto"/>
             <w:vAlign w:val="center"/>
           </w:tcPr>
           <w:p>
@@ -2483,7 +2480,6 @@
         <w:tc>
           <w:tcPr>
             <w:tcW w:w="4115" w:type="dxa"/>
-            <w:shd w:val="clear" w:color="auto" w:fill="auto"/>
             <w:vAlign w:val="center"/>
           </w:tcPr>
           <w:p>
@@ -2513,7 +2509,6 @@
         <w:tc>
           <w:tcPr>
             <w:tcW w:w="5524" w:type="dxa"/>
-            <w:shd w:val="clear" w:color="auto" w:fill="auto"/>
             <w:vAlign w:val="center"/>
           </w:tcPr>
           <w:p>
@@ -2537,7 +2532,6 @@
         <w:tc>
           <w:tcPr>
             <w:tcW w:w="4115" w:type="dxa"/>
-            <w:shd w:val="clear" w:color="auto" w:fill="auto"/>
             <w:vAlign w:val="center"/>
           </w:tcPr>
           <w:p>
@@ -2567,7 +2561,6 @@
         <w:tc>
           <w:tcPr>
             <w:tcW w:w="5524" w:type="dxa"/>
-            <w:shd w:val="clear" w:color="auto" w:fill="auto"/>
             <w:vAlign w:val="center"/>
           </w:tcPr>
           <w:p>
@@ -2591,7 +2584,6 @@
         <w:tc>
           <w:tcPr>
             <w:tcW w:w="4115" w:type="dxa"/>
-            <w:shd w:val="clear" w:color="auto" w:fill="auto"/>
             <w:vAlign w:val="center"/>
           </w:tcPr>
           <w:p>
@@ -2751,7 +2743,6 @@
         <w:tc>
           <w:tcPr>
             <w:tcW w:w="2836" w:type="dxa"/>
-            <w:shd w:val="clear" w:color="auto" w:fill="auto"/>
           </w:tcPr>
           <w:p>
             <w:pPr>
@@ -2777,7 +2768,6 @@
         <w:tc>
           <w:tcPr>
             <w:tcW w:w="6803" w:type="dxa"/>
-            <w:shd w:val="clear" w:color="auto" w:fill="auto"/>
           </w:tcPr>
           <w:p>
             <w:pPr>
@@ -2805,7 +2795,6 @@
         <w:tc>
           <w:tcPr>
             <w:tcW w:w="2836" w:type="dxa"/>
-            <w:shd w:val="clear" w:color="auto" w:fill="auto"/>
           </w:tcPr>
           <w:p>
             <w:pPr>
@@ -2824,14 +2813,31 @@
                 <w:sz w:val="24"/>
                 <w:szCs w:val="24"/>
               </w:rPr>
-              <w:t>2) IEC 60601-1 [2005]+AM1[2012]</w:t>
+              <w:t>2) IEC 60601-1 [</w:t>
+            </w:r>
+            <w:proofErr w:type="gramStart"/>
+            <w:r>
+              <w:rPr>
+                <w:rFonts w:ascii="Times New Roman" w:hAnsi="Times New Roman" w:cs="Times New Roman"/>
+                <w:sz w:val="24"/>
+                <w:szCs w:val="24"/>
+              </w:rPr>
+              <w:t>2005]+</w:t>
+            </w:r>
+            <w:proofErr w:type="gramEnd"/>
+            <w:r>
+              <w:rPr>
+                <w:rFonts w:ascii="Times New Roman" w:hAnsi="Times New Roman" w:cs="Times New Roman"/>
+                <w:sz w:val="24"/>
+                <w:szCs w:val="24"/>
+              </w:rPr>
+              <w:t>AM1[2012]</w:t>
             </w:r>
           </w:p>
         </w:tc>
         <w:tc>
           <w:tcPr>
             <w:tcW w:w="6803" w:type="dxa"/>
-            <w:shd w:val="clear" w:color="auto" w:fill="auto"/>
           </w:tcPr>
           <w:p>
             <w:pPr>
@@ -2859,7 +2865,6 @@
         <w:tc>
           <w:tcPr>
             <w:tcW w:w="2836" w:type="dxa"/>
-            <w:shd w:val="clear" w:color="auto" w:fill="auto"/>
           </w:tcPr>
           <w:p>
             <w:pPr>
@@ -2882,7 +2887,6 @@
         <w:tc>
           <w:tcPr>
             <w:tcW w:w="6803" w:type="dxa"/>
-            <w:shd w:val="clear" w:color="auto" w:fill="auto"/>
           </w:tcPr>
           <w:p>
             <w:pPr>
@@ -2910,7 +2914,6 @@
         <w:tc>
           <w:tcPr>
             <w:tcW w:w="2836" w:type="dxa"/>
-            <w:shd w:val="clear" w:color="auto" w:fill="auto"/>
           </w:tcPr>
           <w:p>
             <w:pPr>
@@ -2936,7 +2939,6 @@
         <w:tc>
           <w:tcPr>
             <w:tcW w:w="6803" w:type="dxa"/>
-            <w:shd w:val="clear" w:color="auto" w:fill="auto"/>
           </w:tcPr>
           <w:p>
             <w:pPr>
@@ -2972,7 +2974,6 @@
         <w:tc>
           <w:tcPr>
             <w:tcW w:w="2836" w:type="dxa"/>
-            <w:shd w:val="clear" w:color="auto" w:fill="auto"/>
           </w:tcPr>
           <w:p>
             <w:pPr>
@@ -2995,14 +2996,31 @@
                 <w:szCs w:val="24"/>
               </w:rPr>
               <w:lastRenderedPageBreak/>
-              <w:t>5) IEC 60601-1-6 [2010]+AMD1[2013]</w:t>
+              <w:t>5) IEC 60601-1-6 [</w:t>
+            </w:r>
+            <w:proofErr w:type="gramStart"/>
+            <w:r>
+              <w:rPr>
+                <w:rFonts w:ascii="Times New Roman" w:hAnsi="Times New Roman" w:cs="Times New Roman"/>
+                <w:sz w:val="24"/>
+                <w:szCs w:val="24"/>
+              </w:rPr>
+              <w:t>2010]+</w:t>
+            </w:r>
+            <w:proofErr w:type="gramEnd"/>
+            <w:r>
+              <w:rPr>
+                <w:rFonts w:ascii="Times New Roman" w:hAnsi="Times New Roman" w:cs="Times New Roman"/>
+                <w:sz w:val="24"/>
+                <w:szCs w:val="24"/>
+              </w:rPr>
+              <w:t>AMD1[2013]</w:t>
             </w:r>
           </w:p>
         </w:tc>
         <w:tc>
           <w:tcPr>
             <w:tcW w:w="6803" w:type="dxa"/>
-            <w:shd w:val="clear" w:color="auto" w:fill="auto"/>
           </w:tcPr>
           <w:p>
             <w:pPr>
@@ -3038,7 +3056,6 @@
         <w:tc>
           <w:tcPr>
             <w:tcW w:w="2836" w:type="dxa"/>
-            <w:shd w:val="clear" w:color="auto" w:fill="auto"/>
           </w:tcPr>
           <w:p>
             <w:pPr>
@@ -3064,7 +3081,6 @@
         <w:tc>
           <w:tcPr>
             <w:tcW w:w="6803" w:type="dxa"/>
-            <w:shd w:val="clear" w:color="auto" w:fill="auto"/>
           </w:tcPr>
           <w:p>
             <w:pPr>
@@ -3100,7 +3116,6 @@
         <w:tc>
           <w:tcPr>
             <w:tcW w:w="2836" w:type="dxa"/>
-            <w:shd w:val="clear" w:color="auto" w:fill="auto"/>
           </w:tcPr>
           <w:p>
             <w:pPr>
@@ -3131,7 +3146,6 @@
         <w:tc>
           <w:tcPr>
             <w:tcW w:w="6803" w:type="dxa"/>
-            <w:shd w:val="clear" w:color="auto" w:fill="auto"/>
           </w:tcPr>
           <w:p>
             <w:pPr>
@@ -3162,7 +3176,6 @@
         <w:tc>
           <w:tcPr>
             <w:tcW w:w="2836" w:type="dxa"/>
-            <w:shd w:val="clear" w:color="auto" w:fill="auto"/>
           </w:tcPr>
           <w:p>
             <w:pPr>
@@ -3193,7 +3206,6 @@
         <w:tc>
           <w:tcPr>
             <w:tcW w:w="6803" w:type="dxa"/>
-            <w:shd w:val="clear" w:color="auto" w:fill="auto"/>
           </w:tcPr>
           <w:p>
             <w:pPr>
@@ -3206,6 +3218,7 @@
                 <w:szCs w:val="24"/>
               </w:rPr>
             </w:pPr>
+            <w:proofErr w:type="gramStart"/>
             <w:r>
               <w:rPr>
                 <w:rFonts w:ascii="Times New Roman" w:hAnsi="Times New Roman" w:cs="Times New Roman"/>
@@ -3213,7 +3226,17 @@
                 <w:sz w:val="24"/>
                 <w:szCs w:val="24"/>
               </w:rPr>
-              <w:t>Establishes the necessary details to be followed in manufacturing or importing, as well as the designation procedures and management methods for quality management auditing institutions and training institutions for quality managers.</w:t>
+              <w:t>Establishes</w:t>
+            </w:r>
+            <w:proofErr w:type="gramEnd"/>
+            <w:r>
+              <w:rPr>
+                <w:rFonts w:ascii="Times New Roman" w:hAnsi="Times New Roman" w:cs="Times New Roman"/>
+                <w:kern w:val="0"/>
+                <w:sz w:val="24"/>
+                <w:szCs w:val="24"/>
+              </w:rPr>
+              <w:t xml:space="preserve"> the necessary details to be followed in manufacturing or importing, as well as the designation procedures and management methods for quality management auditing institutions and training institutions for quality managers.</w:t>
             </w:r>
           </w:p>
         </w:tc>
@@ -3326,7 +3349,7 @@
                     <pic:cNvPicPr/>
                   </pic:nvPicPr>
                   <pic:blipFill>
-                    <a:blip r:embed="rId8"/>
+                    <a:blip r:embed="rId11"/>
                     <a:stretch>
                       <a:fillRect/>
                     </a:stretch>
@@ -3439,7 +3462,7 @@
                     <pic:cNvPicPr/>
                   </pic:nvPicPr>
                   <pic:blipFill>
-                    <a:blip r:embed="rId9">
+                    <a:blip r:embed="rId12">
                       <a:extLst>
                         <a:ext uri="{28A0092B-C50C-407E-A947-70E740481C1C}">
                           <a14:useLocalDpi xmlns:a14="http://schemas.microsoft.com/office/drawing/2010/main" val="0"/>
@@ -3579,7 +3602,6 @@
         <w:tc>
           <w:tcPr>
             <w:tcW w:w="1933" w:type="dxa"/>
-            <w:shd w:val="clear" w:color="auto" w:fill="auto"/>
             <w:tcMar>
               <w:top w:w="28" w:type="dxa"/>
               <w:left w:w="28" w:type="dxa"/>
@@ -3616,7 +3638,6 @@
         <w:tc>
           <w:tcPr>
             <w:tcW w:w="6574" w:type="dxa"/>
-            <w:shd w:val="clear" w:color="auto" w:fill="auto"/>
             <w:tcMar>
               <w:top w:w="28" w:type="dxa"/>
               <w:left w:w="28" w:type="dxa"/>
@@ -3659,7 +3680,6 @@
         <w:tc>
           <w:tcPr>
             <w:tcW w:w="1933" w:type="dxa"/>
-            <w:shd w:val="clear" w:color="auto" w:fill="auto"/>
             <w:tcMar>
               <w:top w:w="28" w:type="dxa"/>
               <w:left w:w="28" w:type="dxa"/>
@@ -3698,7 +3718,6 @@
         <w:tc>
           <w:tcPr>
             <w:tcW w:w="6574" w:type="dxa"/>
-            <w:shd w:val="clear" w:color="auto" w:fill="auto"/>
             <w:tcMar>
               <w:top w:w="28" w:type="dxa"/>
               <w:left w:w="28" w:type="dxa"/>
@@ -3743,7 +3762,6 @@
         <w:tc>
           <w:tcPr>
             <w:tcW w:w="1933" w:type="dxa"/>
-            <w:shd w:val="clear" w:color="auto" w:fill="auto"/>
             <w:tcMar>
               <w:top w:w="28" w:type="dxa"/>
               <w:left w:w="28" w:type="dxa"/>
@@ -3782,7 +3800,6 @@
         <w:tc>
           <w:tcPr>
             <w:tcW w:w="6574" w:type="dxa"/>
-            <w:shd w:val="clear" w:color="auto" w:fill="auto"/>
             <w:tcMar>
               <w:top w:w="28" w:type="dxa"/>
               <w:left w:w="28" w:type="dxa"/>
@@ -4073,7 +4090,25 @@
           <w:sz w:val="24"/>
           <w:szCs w:val="24"/>
         </w:rPr>
-        <w:t>a) Components With High integrity Characteristics</w:t>
+        <w:t xml:space="preserve">a) Components With High </w:t>
+      </w:r>
+      <w:proofErr w:type="gramStart"/>
+      <w:r>
+        <w:rPr>
+          <w:rFonts w:ascii="Times New Roman" w:hAnsi="Times New Roman" w:cs="Times New Roman"/>
+          <w:sz w:val="24"/>
+          <w:szCs w:val="24"/>
+        </w:rPr>
+        <w:t>integrity</w:t>
+      </w:r>
+      <w:proofErr w:type="gramEnd"/>
+      <w:r>
+        <w:rPr>
+          <w:rFonts w:ascii="Times New Roman" w:hAnsi="Times New Roman" w:cs="Times New Roman"/>
+          <w:sz w:val="24"/>
+          <w:szCs w:val="24"/>
+        </w:rPr>
+        <w:t xml:space="preserve"> Characteristics</w:t>
       </w:r>
     </w:p>
     <w:p>
@@ -4264,7 +4299,7 @@
       </w:r>
     </w:p>
     <w:sectPr>
-      <w:headerReference w:type="default" r:id="rId10"/>
+      <w:headerReference w:type="default" r:id="rId13"/>
       <w:pgSz w:w="11906" w:h="16838"/>
       <w:pgMar w:top="1021" w:right="1134" w:bottom="1418" w:left="1134" w:header="851" w:footer="992" w:gutter="0"/>
       <w:cols w:space="425"/>
@@ -6018,6 +6053,26 @@
 </file>
 
 <file path=customXml/item2.xml><?xml version="1.0" encoding="utf-8"?>
+<p:properties xmlns:p="http://schemas.microsoft.com/office/2006/metadata/properties" xmlns:xsi="http://www.w3.org/2001/XMLSchema-instance" xmlns:pc="http://schemas.microsoft.com/office/infopath/2007/PartnerControls">
+  <documentManagement>
+    <lcf76f155ced4ddcb4097134ff3c332f xmlns="e9585e3e-8dde-4558-9020-300460070f66">
+      <Terms xmlns="http://schemas.microsoft.com/office/infopath/2007/PartnerControls"/>
+    </lcf76f155ced4ddcb4097134ff3c332f>
+    <TaxCatchAll xmlns="fdbd0ee6-c1ce-4682-bf4d-b990274ef7f9" xsi:nil="true"/>
+  </documentManagement>
+</p:properties>
+</file>
+
+<file path=customXml/item3.xml><?xml version="1.0" encoding="utf-8"?>
+<?mso-contentType ?>
+<FormTemplates xmlns="http://schemas.microsoft.com/sharepoint/v3/contenttype/forms">
+  <Display>DocumentLibraryForm</Display>
+  <Edit>DocumentLibraryForm</Edit>
+  <New>DocumentLibraryForm</New>
+</FormTemplates>
+</file>
+
+<file path=customXml/item4.xml><?xml version="1.0" encoding="utf-8"?>
 <ct:contentTypeSchema xmlns:ct="http://schemas.microsoft.com/office/2006/metadata/contentType" xmlns:ma="http://schemas.microsoft.com/office/2006/metadata/properties/metaAttributes" ct:_="" ma:_="" ma:contentTypeName="문서" ma:contentTypeID="0x01010055643D1FCDD1AF449E52FCC5650E658B" ma:contentTypeVersion="14" ma:contentTypeDescription="새 문서를 만듭니다." ma:contentTypeScope="" ma:versionID="647bdb025269980e27106cc2d7c93b4b">
   <xsd:schema xmlns:xsd="http://www.w3.org/2001/XMLSchema" xmlns:xs="http://www.w3.org/2001/XMLSchema" xmlns:p="http://schemas.microsoft.com/office/2006/metadata/properties" xmlns:ns2="e9585e3e-8dde-4558-9020-300460070f66" xmlns:ns3="fdbd0ee6-c1ce-4682-bf4d-b990274ef7f9" targetNamespace="http://schemas.microsoft.com/office/2006/metadata/properties" ma:root="true" ma:fieldsID="d9d8955b532099d955db877a9cb0cef3" ns2:_="" ns3:_="">
     <xsd:import namespace="e9585e3e-8dde-4558-9020-300460070f66"/>
@@ -6230,26 +6285,6 @@
 </ct:contentTypeSchema>
 </file>
 
-<file path=customXml/item3.xml><?xml version="1.0" encoding="utf-8"?>
-<?mso-contentType ?>
-<FormTemplates xmlns="http://schemas.microsoft.com/sharepoint/v3/contenttype/forms">
-  <Display>DocumentLibraryForm</Display>
-  <Edit>DocumentLibraryForm</Edit>
-  <New>DocumentLibraryForm</New>
-</FormTemplates>
-</file>
-
-<file path=customXml/item4.xml><?xml version="1.0" encoding="utf-8"?>
-<p:properties xmlns:p="http://schemas.microsoft.com/office/2006/metadata/properties" xmlns:xsi="http://www.w3.org/2001/XMLSchema-instance" xmlns:pc="http://schemas.microsoft.com/office/infopath/2007/PartnerControls">
-  <documentManagement>
-    <lcf76f155ced4ddcb4097134ff3c332f xmlns="e9585e3e-8dde-4558-9020-300460070f66">
-      <Terms xmlns="http://schemas.microsoft.com/office/infopath/2007/PartnerControls"/>
-    </lcf76f155ced4ddcb4097134ff3c332f>
-    <TaxCatchAll xmlns="fdbd0ee6-c1ce-4682-bf4d-b990274ef7f9" xsi:nil="true"/>
-  </documentManagement>
-</p:properties>
-</file>
-
 <file path=customXml/itemProps1.xml><?xml version="1.0" encoding="utf-8"?>
 <ds:datastoreItem xmlns:ds="http://schemas.openxmlformats.org/officeDocument/2006/customXml" ds:itemID="{61876077-166A-41BF-877E-DCC41435A2DA}">
   <ds:schemaRefs>
@@ -6259,13 +6294,39 @@
 </file>
 
 <file path=customXml/itemProps2.xml><?xml version="1.0" encoding="utf-8"?>
-<ds:datastoreItem xmlns:ds="http://schemas.openxmlformats.org/officeDocument/2006/customXml" ds:itemID="{5898A924-37EF-432E-AED6-C2AAD852AFC3}"/>
+<ds:datastoreItem xmlns:ds="http://schemas.openxmlformats.org/officeDocument/2006/customXml" ds:itemID="{57519515-FD00-4DBD-B34E-D27856804FFB}">
+  <ds:schemaRefs>
+    <ds:schemaRef ds:uri="http://schemas.microsoft.com/office/2006/metadata/properties"/>
+    <ds:schemaRef ds:uri="http://schemas.microsoft.com/office/infopath/2007/PartnerControls"/>
+    <ds:schemaRef ds:uri="e9585e3e-8dde-4558-9020-300460070f66"/>
+    <ds:schemaRef ds:uri="fdbd0ee6-c1ce-4682-bf4d-b990274ef7f9"/>
+  </ds:schemaRefs>
+</ds:datastoreItem>
 </file>
 
 <file path=customXml/itemProps3.xml><?xml version="1.0" encoding="utf-8"?>
-<ds:datastoreItem xmlns:ds="http://schemas.openxmlformats.org/officeDocument/2006/customXml" ds:itemID="{68AD2B7C-A332-4C23-96AB-E03F2B945A0D}"/>
+<ds:datastoreItem xmlns:ds="http://schemas.openxmlformats.org/officeDocument/2006/customXml" ds:itemID="{68AD2B7C-A332-4C23-96AB-E03F2B945A0D}">
+  <ds:schemaRefs>
+    <ds:schemaRef ds:uri="http://schemas.microsoft.com/sharepoint/v3/contenttype/forms"/>
+  </ds:schemaRefs>
+</ds:datastoreItem>
 </file>
 
 <file path=customXml/itemProps4.xml><?xml version="1.0" encoding="utf-8"?>
-<ds:datastoreItem xmlns:ds="http://schemas.openxmlformats.org/officeDocument/2006/customXml" ds:itemID="{57519515-FD00-4DBD-B34E-D27856804FFB}"/>
+<ds:datastoreItem xmlns:ds="http://schemas.openxmlformats.org/officeDocument/2006/customXml" ds:itemID="{5898A924-37EF-432E-AED6-C2AAD852AFC3}">
+  <ds:schemaRefs>
+    <ds:schemaRef ds:uri="http://schemas.microsoft.com/office/2006/metadata/contentType"/>
+    <ds:schemaRef ds:uri="http://schemas.microsoft.com/office/2006/metadata/properties/metaAttributes"/>
+    <ds:schemaRef ds:uri="http://www.w3.org/2001/XMLSchema"/>
+    <ds:schemaRef ds:uri="http://schemas.microsoft.com/office/2006/metadata/properties"/>
+    <ds:schemaRef ds:uri="e9585e3e-8dde-4558-9020-300460070f66"/>
+    <ds:schemaRef ds:uri="fdbd0ee6-c1ce-4682-bf4d-b990274ef7f9"/>
+    <ds:schemaRef ds:uri="http://schemas.microsoft.com/office/2006/documentManagement/types"/>
+    <ds:schemaRef ds:uri="http://schemas.microsoft.com/office/infopath/2007/PartnerControls"/>
+    <ds:schemaRef ds:uri="http://schemas.openxmlformats.org/package/2006/metadata/core-properties"/>
+    <ds:schemaRef ds:uri="http://purl.org/dc/elements/1.1/"/>
+    <ds:schemaRef ds:uri="http://purl.org/dc/terms/"/>
+    <ds:schemaRef ds:uri="http://schemas.microsoft.com/internal/obd"/>
+  </ds:schemaRefs>
+</ds:datastoreItem>
 </file>
</xml_diff>